<commit_message>
Document notification and exploration validation boundaries
</commit_message>
<xml_diff>
--- a/docs/智能投资顾问系统课程设计报告.docx
+++ b/docs/智能投资顾问系统课程设计报告.docx
@@ -2204,7 +2204,7 @@
                 <w:color w:val="000000"/>
                 <w:sz w:val="24"/>
               </w:rPr>
-              <w:t>长周期训练81469条、验证22459条、测试34165条，测试日期2025年11月3日至2026年7月28日。已见股票MAE为0.162259，常数基线0.162219；未见股票8582条，MAE为0.148478，基线0.148376。两者均未优于常数，因此界面提示弱有效性，长期配置关闭收益择股分数，只使用风险优化。自动晋升新增长期基线检查。长期模块报告预测误差，没有伪造长期策略回测。</w:t>
+              <w:t>长周期训练81469条、验证22459条、测试34165条，测试日期2025年11月3日至2026年7月28日。已见股票MAE为0.162259，常数基线0.162219；未见股票8582条，MAE为0.148478，基线0.148376。两者均未优于常数，因此界面提示弱有效性，长期配置不提供未通过基线检查的股票备选，保留现金。自动晋升新增长期基线检查。长期模块报告预测误差，没有伪造长期策略回测。</w:t>
             </w:r>
           </w:p>
         </w:tc>
@@ -4333,6 +4333,35 @@
         <w:tc>
           <w:tcPr>
             <w:tcW w:w="10000" w:type="dxa"/>
+          </w:tcPr>
+          <w:p>
+            <w:pPr>
+              <w:keepNext w:val="0"/>
+              <w:keepLines/>
+              <w:widowControl/>
+              <w:spacing w:before="0" w:after="80" w:line="300" w:lineRule="auto"/>
+              <w:ind w:firstLine="480"/>
+              <w:jc w:val="both"/>
+            </w:pPr>
+            <w:r>
+              <w:rPr>
+                <w:rFonts w:ascii="Times New Roman" w:hAnsi="Times New Roman" w:eastAsia="宋体"/>
+                <w:b w:val="0"/>
+                <w:color w:val="000000"/>
+                <w:sz w:val="24"/>
+              </w:rPr>
+              <w:t>组合与咨询共用判断、公告和新闻流程；自动备选要求上涨估计严格高于下跌，并排除高下探风险和近期公告风险关键词。提供多种组合与单股备选，刷新时轮换候选。风险画像自动设置风格与投入，但允许手动覆盖。成交录入同时显示股数乘参考价及加减费用后的净收支。开屏展示风险声明，程序不执行交易。方向概率仍未校准，已有回测不代表新版组合规则的业绩。旧测试数据库隔离缺陷已修复，增加临时目录强制检查和启动账本快照。</w:t>
+            </w:r>
+          </w:p>
+        </w:tc>
+      </w:tr>
+      <w:tr>
+        <w:trPr>
+          <w:cantSplit/>
+        </w:trPr>
+        <w:tc>
+          <w:tcPr>
+            <w:tcW w:w="10000" w:type="dxa"/>
             <w:tcBorders>
               <w:bottom w:val="single" w:sz="4" w:color="auto"/>
             </w:tcBorders>
@@ -4353,7 +4382,7 @@
                 <w:color w:val="000000"/>
                 <w:sz w:val="24"/>
               </w:rPr>
-              <w:t>组合与咨询共用判断、公告和新闻流程；自动备选要求上涨估计严格高于下跌，并排除高下探风险和近期公告风险关键词。提供多种组合与单股备选，刷新时轮换候选。风险画像自动设置风格与投入，但允许手动覆盖。成交录入同时显示股数乘参考价及加减费用后的净收支。开屏展示风险声明，程序不执行交易。方向概率仍未校准，已有回测不代表新版组合规则的业绩。旧测试数据库隔离缺陷已修复，增加临时目录强制检查和启动账本快照。</w:t>
+              <w:t>本轮54项隔离测试通过。新增Telegram与企业微信群通知接口，支持新风险事件、定时摘要、失败重试与发送记录；默认关闭，凭据由Windows按当前用户加密。已测试模拟接口与本机加密，尚未绑定真实账号验证送达。资产配置支持0至50%的ε探索：按概率将部分候选替换为当前行业目录内的训练池外股票，排除独立留出组，仍须通过咨询复核。保存探索记录供结果成熟后评估，当前没有收益改善结论，也没有自动更新探索奖励。</w:t>
             </w:r>
           </w:p>
         </w:tc>

</xml_diff>